<commit_message>
fix(typography): khac phuc loi font chu tieng viet, dong bo utf8mb4 va toi uu hoa phong chu inter
</commit_message>
<xml_diff>
--- a/Bao_Cao_De_Tai_13_Phan_Quang_Tung.docx
+++ b/Bao_Cao_De_Tai_13_Phan_Quang_Tung.docx
@@ -4067,7 +4067,7 @@
       <w:r>
         <w:drawing>
           <wp:inline xmlns:a="http://schemas.openxmlformats.org/drawingml/2006/main" xmlns:pic="http://schemas.openxmlformats.org/drawingml/2006/picture">
-            <wp:extent cx="5303520" cy="3425483"/>
+            <wp:extent cx="5303520" cy="3535680"/>
             <wp:docPr id="7" name="Picture 7"/>
             <wp:cNvGraphicFramePr>
               <a:graphicFrameLocks noChangeAspect="1"/>
@@ -4088,7 +4088,7 @@
                   <pic:spPr>
                     <a:xfrm>
                       <a:off x="0" y="0"/>
-                      <a:ext cx="5303520" cy="3425483"/>
+                      <a:ext cx="5303520" cy="3535680"/>
                     </a:xfrm>
                     <a:prstGeom prst="rect"/>
                   </pic:spPr>

</xml_diff>